<commit_message>
Procesos Básicos III: presentación de De Neys con 2 minutos por expositor
Reparte el guion en cinco partes iguales de 2 minutos (unas 250 palabras
cada una). La diapositiva del modelo pasa del expositor 1 al 2, para que
el primero cuente solo el experimento; las partes 2 y 3 suman un ejemplo
cada una. Las notas del orador y los tiempos se actualizan.

Co-Authored-By: Claude Opus 5.5 <noreply@anthropic.com>
Claude-Session: https://claude.ai/code/session_014TgNuKp3tg1RihixbZ4R3r
</commit_message>
<xml_diff>
--- a/2do Año/Procesos Básicos III/6_Entregables/U03_PresentacionArticulo_FastAndSlowThinking_Guion.docx
+++ b/2do Año/Procesos Básicos III/6_Entregables/U03_PresentacionArticulo_FastAndSlowThinking_Guion.docx
@@ -36,13 +36,13 @@
           <w:bCs/>
           <w:b/>
         </w:rPr>
-        <w:t xml:space="preserve">Duración total: 9 min 45 s</w:t>
-      </w:r>
-      <w:r>
-        <w:t xml:space="preserve"> </w:t>
-      </w:r>
-      <w:r>
-        <w:t xml:space="preserve">(máximo 10). A ritmo de exposición (unas 130 palabras por minuto), cada bloque tiene el largo justo para su tiempo. Ensayen con cronómetro. Las notas en recuadro («Si preguntan…»)</w:t>
+        <w:t xml:space="preserve">Duración total: 10 minutos, 2 por persona.</w:t>
+      </w:r>
+      <w:r>
+        <w:t xml:space="preserve"> </w:t>
+      </w:r>
+      <w:r>
+        <w:t xml:space="preserve">Cada parte tiene unas 250 palabras, que a ritmo de exposición (unas 130 por minuto) dan 1:55. Esos segundos de margen son para pasar de una diapositiva a otra y para cambiar de expositor. Ensayen con cronómetro. Las notas en recuadro («Si preguntan…»)</w:t>
       </w:r>
       <w:r>
         <w:t xml:space="preserve"> </w:t>
@@ -170,31 +170,31 @@
               <w:jc w:val="left"/>
             </w:pPr>
             <w:r>
-              <w:t xml:space="preserve">1-5</w:t>
-            </w:r>
-          </w:p>
-        </w:tc>
-        <w:tc>
-          <w:tcPr/>
-          <w:p>
-            <w:pPr>
-              <w:pStyle w:val="Compact"/>
-              <w:jc w:val="left"/>
-            </w:pPr>
-            <w:r>
-              <w:t xml:space="preserve">3:10</w:t>
-            </w:r>
-          </w:p>
-        </w:tc>
-        <w:tc>
-          <w:tcPr/>
-          <w:p>
-            <w:pPr>
-              <w:pStyle w:val="Compact"/>
-              <w:jc w:val="left"/>
-            </w:pPr>
-            <w:r>
-              <w:t xml:space="preserve">3:10</w:t>
+              <w:t xml:space="preserve">1-4</w:t>
+            </w:r>
+          </w:p>
+        </w:tc>
+        <w:tc>
+          <w:tcPr/>
+          <w:p>
+            <w:pPr>
+              <w:pStyle w:val="Compact"/>
+              <w:jc w:val="left"/>
+            </w:pPr>
+            <w:r>
+              <w:t xml:space="preserve">2:00</w:t>
+            </w:r>
+          </w:p>
+        </w:tc>
+        <w:tc>
+          <w:tcPr/>
+          <w:p>
+            <w:pPr>
+              <w:pStyle w:val="Compact"/>
+              <w:jc w:val="left"/>
+            </w:pPr>
+            <w:r>
+              <w:t xml:space="preserve">2:00</w:t>
             </w:r>
           </w:p>
         </w:tc>
@@ -220,43 +220,43 @@
               <w:jc w:val="left"/>
             </w:pPr>
             <w:r>
-              <w:t xml:space="preserve">Acierto 1: un mecanismo donde Evans no lo tenía</w:t>
-            </w:r>
-          </w:p>
-        </w:tc>
-        <w:tc>
-          <w:tcPr/>
-          <w:p>
-            <w:pPr>
-              <w:pStyle w:val="Compact"/>
-              <w:jc w:val="left"/>
-            </w:pPr>
-            <w:r>
-              <w:t xml:space="preserve">6</w:t>
-            </w:r>
-          </w:p>
-        </w:tc>
-        <w:tc>
-          <w:tcPr/>
-          <w:p>
-            <w:pPr>
-              <w:pStyle w:val="Compact"/>
-              <w:jc w:val="left"/>
-            </w:pPr>
-            <w:r>
-              <w:t xml:space="preserve">1:25</w:t>
-            </w:r>
-          </w:p>
-        </w:tc>
-        <w:tc>
-          <w:tcPr/>
-          <w:p>
-            <w:pPr>
-              <w:pStyle w:val="Compact"/>
-              <w:jc w:val="left"/>
-            </w:pPr>
-            <w:r>
-              <w:t xml:space="preserve">4:35</w:t>
+              <w:t xml:space="preserve">La propuesta del autor y acierto 1: un mecanismo donde Evans no lo tenía</w:t>
+            </w:r>
+          </w:p>
+        </w:tc>
+        <w:tc>
+          <w:tcPr/>
+          <w:p>
+            <w:pPr>
+              <w:pStyle w:val="Compact"/>
+              <w:jc w:val="left"/>
+            </w:pPr>
+            <w:r>
+              <w:t xml:space="preserve">5-6</w:t>
+            </w:r>
+          </w:p>
+        </w:tc>
+        <w:tc>
+          <w:tcPr/>
+          <w:p>
+            <w:pPr>
+              <w:pStyle w:val="Compact"/>
+              <w:jc w:val="left"/>
+            </w:pPr>
+            <w:r>
+              <w:t xml:space="preserve">2:00</w:t>
+            </w:r>
+          </w:p>
+        </w:tc>
+        <w:tc>
+          <w:tcPr/>
+          <w:p>
+            <w:pPr>
+              <w:pStyle w:val="Compact"/>
+              <w:jc w:val="left"/>
+            </w:pPr>
+            <w:r>
+              <w:t xml:space="preserve">4:00</w:t>
             </w:r>
           </w:p>
         </w:tc>
@@ -306,19 +306,19 @@
               <w:jc w:val="left"/>
             </w:pPr>
             <w:r>
-              <w:t xml:space="preserve">1:20</w:t>
-            </w:r>
-          </w:p>
-        </w:tc>
-        <w:tc>
-          <w:tcPr/>
-          <w:p>
-            <w:pPr>
-              <w:pStyle w:val="Compact"/>
-              <w:jc w:val="left"/>
-            </w:pPr>
-            <w:r>
-              <w:t xml:space="preserve">5:55</w:t>
+              <w:t xml:space="preserve">2:00</w:t>
+            </w:r>
+          </w:p>
+        </w:tc>
+        <w:tc>
+          <w:tcPr/>
+          <w:p>
+            <w:pPr>
+              <w:pStyle w:val="Compact"/>
+              <w:jc w:val="left"/>
+            </w:pPr>
+            <w:r>
+              <w:t xml:space="preserve">6:00</w:t>
             </w:r>
           </w:p>
         </w:tc>
@@ -368,19 +368,19 @@
               <w:jc w:val="left"/>
             </w:pPr>
             <w:r>
-              <w:t xml:space="preserve">1:40</w:t>
-            </w:r>
-          </w:p>
-        </w:tc>
-        <w:tc>
-          <w:tcPr/>
-          <w:p>
-            <w:pPr>
-              <w:pStyle w:val="Compact"/>
-              <w:jc w:val="left"/>
-            </w:pPr>
-            <w:r>
-              <w:t xml:space="preserve">7:35</w:t>
+              <w:t xml:space="preserve">2:00</w:t>
+            </w:r>
+          </w:p>
+        </w:tc>
+        <w:tc>
+          <w:tcPr/>
+          <w:p>
+            <w:pPr>
+              <w:pStyle w:val="Compact"/>
+              <w:jc w:val="left"/>
+            </w:pPr>
+            <w:r>
+              <w:t xml:space="preserve">8:00</w:t>
             </w:r>
           </w:p>
         </w:tc>
@@ -430,19 +430,19 @@
               <w:jc w:val="left"/>
             </w:pPr>
             <w:r>
-              <w:t xml:space="preserve">2:10</w:t>
-            </w:r>
-          </w:p>
-        </w:tc>
-        <w:tc>
-          <w:tcPr/>
-          <w:p>
-            <w:pPr>
-              <w:pStyle w:val="Compact"/>
-              <w:jc w:val="left"/>
-            </w:pPr>
-            <w:r>
-              <w:t xml:space="preserve">9:45</w:t>
+              <w:t xml:space="preserve">2:00</w:t>
+            </w:r>
+          </w:p>
+        </w:tc>
+        <w:tc>
+          <w:tcPr/>
+          <w:p>
+            <w:pPr>
+              <w:pStyle w:val="Compact"/>
+              <w:jc w:val="left"/>
+            </w:pPr>
+            <w:r>
+              <w:t xml:space="preserve">10:00</w:t>
             </w:r>
           </w:p>
         </w:tc>
@@ -595,13 +595,13 @@
         </w:pict>
       </w:r>
     </w:p>
-    <w:bookmarkStart w:id="25" w:name="Xb776255ffb2fc1e51d50da97095c205dd16672a"/>
+    <w:bookmarkStart w:id="24" w:name="X928d6e5e5a0c8ebfb4c97478ae39fdde72c4584"/>
     <w:p>
       <w:pPr>
         <w:pStyle w:val="Heading2"/>
       </w:pPr>
       <w:r>
-        <w:t xml:space="preserve">Expositor/a 1 — Apertura y el experimento (3:10)</w:t>
+        <w:t xml:space="preserve">Expositor/a 1 — Apertura y el experimento (2:00)</w:t>
       </w:r>
     </w:p>
     <w:bookmarkStart w:id="20" w:name="diapositiva-1-portada-015"/>
@@ -644,17 +644,17 @@
         <w:t xml:space="preserve">Behavioral and Brain Sciences</w:t>
       </w:r>
       <w:r>
-        <w:t xml:space="preserve">. Yo les voy a contar qué problema plantea y cómo se investigó; después vienen los aciertos y las críticas.</w:t>
+        <w:t xml:space="preserve">. Yo les cuento cómo se investigó; después vienen la propuesta, los aciertos y las críticas.</w:t>
       </w:r>
     </w:p>
     <w:bookmarkEnd w:id="20"/>
-    <w:bookmarkStart w:id="21" w:name="X049ed4834fa31d16a97f928f6dc6daefe3c32a8"/>
+    <w:bookmarkStart w:id="21" w:name="X0a7c1d18f1b0da1dcdd12db2bc7ac8213ce03dd"/>
     <w:p>
       <w:pPr>
         <w:pStyle w:val="Heading3"/>
       </w:pPr>
       <w:r>
-        <w:t xml:space="preserve">Diapositiva 2 — El problema: dos sistemas y dos supuestos (0:45)</w:t>
+        <w:t xml:space="preserve">Diapositiva 2 — El problema: dos sistemas y dos supuestos (0:30)</w:t>
       </w:r>
     </w:p>
     <w:p>
@@ -688,7 +688,66 @@
         <w:t xml:space="preserve">sistema 2</w:t>
       </w:r>
       <w:r>
-        <w:t xml:space="preserve">, deliberado, lento y costoso. Con ella se explican los sesgos de razonamiento, el juicio moral y la cooperación.</w:t>
+        <w:t xml:space="preserve">, deliberado, lento y costoso. De Neys cuestiona dos supuestos. La</w:t>
+      </w:r>
+      <w:r>
+        <w:t xml:space="preserve"> </w:t>
+      </w:r>
+      <w:r>
+        <w:rPr>
+          <w:bCs/>
+          <w:b/>
+        </w:rPr>
+        <w:t xml:space="preserve">exclusividad</w:t>
+      </w:r>
+      <w:r>
+        <w:t xml:space="preserve">: que la respuesta correcta solo la da el sistema 2, que tiene que corregir una intuición equivocada. Y el</w:t>
+      </w:r>
+      <w:r>
+        <w:t xml:space="preserve"> </w:t>
+      </w:r>
+      <w:r>
+        <w:rPr>
+          <w:bCs/>
+          <w:b/>
+        </w:rPr>
+        <w:t xml:space="preserve">mecanismo de cambio</w:t>
+      </w:r>
+      <w:r>
+        <w:t xml:space="preserve">: cómo sabe una persona, sola, cuándo dejar la intuición y ponerse a pensar.</w:t>
+      </w:r>
+    </w:p>
+    <w:bookmarkEnd w:id="21"/>
+    <w:bookmarkStart w:id="22" w:name="Xe48f3d310f466c7bd2a3e7c73b8073d38b93bbb"/>
+    <w:p>
+      <w:pPr>
+        <w:pStyle w:val="Heading3"/>
+      </w:pPr>
+      <w:r>
+        <w:t xml:space="preserve">Diapositiva 3 — El experimento: el paradigma de dos respuestas (0:45)</w:t>
+      </w:r>
+    </w:p>
+    <w:p>
+      <w:pPr>
+        <w:pStyle w:val="FirstParagraph"/>
+      </w:pPr>
+      <w:r>
+        <w:t xml:space="preserve">El artículo es una revisión teórica, pero se apoya en un tipo de experimento. Por ejemplo:</w:t>
+      </w:r>
+      <w:r>
+        <w:t xml:space="preserve"> </w:t>
+      </w:r>
+      <w:r>
+        <w:t xml:space="preserve">“</w:t>
+      </w:r>
+      <w:r>
+        <w:t xml:space="preserve">Un bate y una pelota cuestan 1,10 dólares. El bate cuesta 1 dólar más que la pelota. ¿Cuánto cuesta la pelota?</w:t>
+      </w:r>
+      <w:r>
+        <w:t xml:space="preserve">”</w:t>
+      </w:r>
+      <w:r>
+        <w:t xml:space="preserve">. La respuesta que salta es 10 centavos; la correcta es 5.</w:t>
       </w:r>
     </w:p>
     <w:p>
@@ -696,43 +755,127 @@
         <w:pStyle w:val="BodyText"/>
       </w:pPr>
       <w:r>
-        <w:t xml:space="preserve">De Neys cuestiona dos supuestos. La</w:t>
-      </w:r>
-      <w:r>
-        <w:t xml:space="preserve"> </w:t>
-      </w:r>
-      <w:r>
-        <w:rPr>
-          <w:bCs/>
-          <w:b/>
-        </w:rPr>
-        <w:t xml:space="preserve">exclusividad</w:t>
-      </w:r>
-      <w:r>
-        <w:t xml:space="preserve">: que la respuesta correcta está fuera del alcance de la intuición, y que para acertar el sistema 2 tiene que corregir una intuición equivocada. Y el</w:t>
-      </w:r>
-      <w:r>
-        <w:t xml:space="preserve"> </w:t>
-      </w:r>
-      <w:r>
-        <w:rPr>
-          <w:bCs/>
-          <w:b/>
-        </w:rPr>
-        <w:t xml:space="preserve">mecanismo de cambio</w:t>
-      </w:r>
-      <w:r>
-        <w:t xml:space="preserve">: cómo sabe una persona, sola, cuándo dejar la intuición y ponerse a pensar. Su hipótesis es que, mientras se sostenga la exclusividad, el cambio no se puede explicar.</w:t>
-      </w:r>
-    </w:p>
-    <w:bookmarkEnd w:id="21"/>
-    <w:bookmarkStart w:id="22" w:name="Xcc866c60290775d352cb27a1927aec821fa7197"/>
+        <w:t xml:space="preserve">En el</w:t>
+      </w:r>
+      <w:r>
+        <w:t xml:space="preserve"> </w:t>
+      </w:r>
+      <w:r>
+        <w:rPr>
+          <w:bCs/>
+          <w:b/>
+        </w:rPr>
+        <w:t xml:space="preserve">paradigma de dos respuestas</w:t>
+      </w:r>
+      <w:r>
+        <w:t xml:space="preserve">, la persona responde dos veces. Primero, con</w:t>
+      </w:r>
+      <w:r>
+        <w:t xml:space="preserve"> </w:t>
+      </w:r>
+      <w:r>
+        <w:rPr>
+          <w:bCs/>
+          <w:b/>
+        </w:rPr>
+        <w:t xml:space="preserve">presión de tiempo</w:t>
+      </w:r>
+      <w:r>
+        <w:t xml:space="preserve"> </w:t>
+      </w:r>
+      <w:r>
+        <w:t xml:space="preserve">y haciendo a la vez</w:t>
+      </w:r>
+      <w:r>
+        <w:t xml:space="preserve"> </w:t>
+      </w:r>
+      <w:r>
+        <w:rPr>
+          <w:bCs/>
+          <w:b/>
+        </w:rPr>
+        <w:t xml:space="preserve">una tarea de memoria</w:t>
+      </w:r>
+      <w:r>
+        <w:t xml:space="preserve">, para que no pueda deliberar. Después,</w:t>
+      </w:r>
+      <w:r>
+        <w:t xml:space="preserve"> </w:t>
+      </w:r>
+      <w:r>
+        <w:rPr>
+          <w:bCs/>
+          <w:b/>
+        </w:rPr>
+        <w:t xml:space="preserve">sin límite</w:t>
+      </w:r>
+      <w:r>
+        <w:t xml:space="preserve">. Se miden el</w:t>
+      </w:r>
+      <w:r>
+        <w:t xml:space="preserve"> </w:t>
+      </w:r>
+      <w:r>
+        <w:rPr>
+          <w:bCs/>
+          <w:b/>
+        </w:rPr>
+        <w:t xml:space="preserve">tiempo</w:t>
+      </w:r>
+      <w:r>
+        <w:t xml:space="preserve"> </w:t>
+      </w:r>
+      <w:r>
+        <w:t xml:space="preserve">y la</w:t>
+      </w:r>
+      <w:r>
+        <w:t xml:space="preserve"> </w:t>
+      </w:r>
+      <w:r>
+        <w:rPr>
+          <w:bCs/>
+          <w:b/>
+        </w:rPr>
+        <w:t xml:space="preserve">confianza</w:t>
+      </w:r>
+      <w:r>
+        <w:t xml:space="preserve">, y se comparan problemas</w:t>
+      </w:r>
+      <w:r>
+        <w:t xml:space="preserve"> </w:t>
+      </w:r>
+      <w:r>
+        <w:rPr>
+          <w:bCs/>
+          <w:b/>
+        </w:rPr>
+        <w:t xml:space="preserve">con conflicto</w:t>
+      </w:r>
+      <w:r>
+        <w:t xml:space="preserve">, como este, y</w:t>
+      </w:r>
+      <w:r>
+        <w:t xml:space="preserve"> </w:t>
+      </w:r>
+      <w:r>
+        <w:rPr>
+          <w:bCs/>
+          <w:b/>
+        </w:rPr>
+        <w:t xml:space="preserve">sin conflicto</w:t>
+      </w:r>
+      <w:r>
+        <w:t xml:space="preserve">.</w:t>
+      </w:r>
+    </w:p>
+    <w:bookmarkEnd w:id="22"/>
+    <w:bookmarkStart w:id="23" w:name="Xd3e30180e074e6af2e505740cfc0e538bcc1e66"/>
     <w:p>
       <w:pPr>
         <w:pStyle w:val="Heading3"/>
       </w:pPr>
       <w:r>
-        <w:t xml:space="preserve">Diapositiva 3 — El experimento: el paradigma de dos respuestas (1:00)</w:t>
+        <w:t xml:space="preserve">Diapositiva 4 — Lo que mostraron los resultados (0:30)</w:t>
       </w:r>
     </w:p>
     <w:p>
@@ -740,168 +883,17 @@
         <w:pStyle w:val="FirstParagraph"/>
       </w:pPr>
       <w:r>
-        <w:t xml:space="preserve">El artículo es una revisión teórica, no un experimento propio, pero toda la revisión se apoya en un tipo de experimento. Tomemos este problema:</w:t>
-      </w:r>
-      <w:r>
-        <w:t xml:space="preserve"> </w:t>
-      </w:r>
-      <w:r>
-        <w:t xml:space="preserve">“</w:t>
-      </w:r>
-      <w:r>
-        <w:t xml:space="preserve">Un bate y una pelota cuestan 1,10 dólares. El bate cuesta 1 dólar más que la pelota. ¿Cuánto cuesta la pelota?</w:t>
-      </w:r>
-      <w:r>
-        <w:t xml:space="preserve">”</w:t>
-      </w:r>
-      <w:r>
-        <w:t xml:space="preserve">. La respuesta que salta es 10 centavos; la correcta es 5.</w:t>
-      </w:r>
-    </w:p>
-    <w:p>
-      <w:pPr>
-        <w:pStyle w:val="BodyText"/>
-      </w:pPr>
-      <w:r>
-        <w:t xml:space="preserve">En el</w:t>
-      </w:r>
-      <w:r>
-        <w:t xml:space="preserve"> </w:t>
-      </w:r>
-      <w:r>
-        <w:rPr>
-          <w:bCs/>
-          <w:b/>
-        </w:rPr>
-        <w:t xml:space="preserve">paradigma de dos respuestas</w:t>
-      </w:r>
-      <w:r>
-        <w:t xml:space="preserve">, la persona responde dos veces. Primero, con</w:t>
-      </w:r>
-      <w:r>
-        <w:t xml:space="preserve"> </w:t>
-      </w:r>
-      <w:r>
-        <w:rPr>
-          <w:bCs/>
-          <w:b/>
-        </w:rPr>
-        <w:t xml:space="preserve">presión de tiempo</w:t>
-      </w:r>
-      <w:r>
-        <w:t xml:space="preserve"> </w:t>
-      </w:r>
-      <w:r>
-        <w:t xml:space="preserve">y haciendo a la vez</w:t>
-      </w:r>
-      <w:r>
-        <w:t xml:space="preserve"> </w:t>
-      </w:r>
-      <w:r>
-        <w:rPr>
-          <w:bCs/>
-          <w:b/>
-        </w:rPr>
-        <w:t xml:space="preserve">una tarea de memoria</w:t>
-      </w:r>
-      <w:r>
-        <w:t xml:space="preserve">, para que no pueda deliberar. Después,</w:t>
-      </w:r>
-      <w:r>
-        <w:t xml:space="preserve"> </w:t>
-      </w:r>
-      <w:r>
-        <w:rPr>
-          <w:bCs/>
-          <w:b/>
-        </w:rPr>
-        <w:t xml:space="preserve">sin límite</w:t>
-      </w:r>
-      <w:r>
-        <w:t xml:space="preserve">. En cada respuesta se miden el</w:t>
-      </w:r>
-      <w:r>
-        <w:t xml:space="preserve"> </w:t>
-      </w:r>
-      <w:r>
-        <w:rPr>
-          <w:bCs/>
-          <w:b/>
-        </w:rPr>
-        <w:t xml:space="preserve">tiempo</w:t>
-      </w:r>
-      <w:r>
-        <w:t xml:space="preserve"> </w:t>
-      </w:r>
-      <w:r>
-        <w:t xml:space="preserve">y la</w:t>
-      </w:r>
-      <w:r>
-        <w:t xml:space="preserve"> </w:t>
-      </w:r>
-      <w:r>
-        <w:rPr>
-          <w:bCs/>
-          <w:b/>
-        </w:rPr>
-        <w:t xml:space="preserve">confianza</w:t>
-      </w:r>
-      <w:r>
-        <w:t xml:space="preserve">, y se comparan versiones</w:t>
-      </w:r>
-      <w:r>
-        <w:t xml:space="preserve"> </w:t>
-      </w:r>
-      <w:r>
-        <w:rPr>
-          <w:bCs/>
-          <w:b/>
-        </w:rPr>
-        <w:t xml:space="preserve">con conflicto</w:t>
-      </w:r>
-      <w:r>
-        <w:t xml:space="preserve">, como esta, y</w:t>
-      </w:r>
-      <w:r>
-        <w:t xml:space="preserve"> </w:t>
-      </w:r>
-      <w:r>
-        <w:rPr>
-          <w:bCs/>
-          <w:b/>
-        </w:rPr>
-        <w:t xml:space="preserve">sin conflicto</w:t>
-      </w:r>
-      <w:r>
-        <w:t xml:space="preserve">, donde intuición y lógica coinciden. Se usó en razonamiento lógico, juicio moral y conducta prosocial.</w:t>
-      </w:r>
-    </w:p>
-    <w:bookmarkEnd w:id="22"/>
-    <w:bookmarkStart w:id="23" w:name="X02cbcc72ace77fa6bb1f2054edb5368203e95b3"/>
-    <w:p>
-      <w:pPr>
-        <w:pStyle w:val="Heading3"/>
-      </w:pPr>
-      <w:r>
-        <w:t xml:space="preserve">Diapositiva 4 — Lo que mostraron los resultados (0:35)</w:t>
-      </w:r>
-    </w:p>
-    <w:p>
-      <w:pPr>
-        <w:pStyle w:val="FirstParagraph"/>
-      </w:pPr>
-      <w:r>
-        <w:t xml:space="preserve">Tres resultados. Uno: impedir la deliberación baja el acierto mucho menos de lo esperado, de un 62 % a un 52 % según un metaanálisis (Lawson et al., 2020, como se citó en De Neys, 2023a). Dos: quienes aciertan al final, en general</w:t>
-      </w:r>
-      <w:r>
-        <w:t xml:space="preserve"> </w:t>
-      </w:r>
-      <w:r>
-        <w:rPr>
-          <w:bCs/>
-          <w:b/>
-        </w:rPr>
-        <w:t xml:space="preserve">ya habían acertado en la respuesta intuitiva</w:t>
+        <w:t xml:space="preserve">Tres resultados. Uno: impedir la deliberación baja el acierto mucho menos de lo esperado, de un 62 % a un 52 % (Lawson et al., 2020, como se citó en De Neys, 2023a). Dos: quienes aciertan al final</w:t>
+      </w:r>
+      <w:r>
+        <w:t xml:space="preserve"> </w:t>
+      </w:r>
+      <w:r>
+        <w:rPr>
+          <w:bCs/>
+          <w:b/>
+        </w:rPr>
+        <w:t xml:space="preserve">ya acertaban en la respuesta intuitiva</w:t>
       </w:r>
       <w:r>
         <w:t xml:space="preserve">. Tres:</w:t>
@@ -920,192 +912,7 @@
         <w:t xml:space="preserve"> </w:t>
       </w:r>
       <w:r>
-        <w:t xml:space="preserve">cuando hay conflicto; algo detecta el choque, aunque no lo corrijan.</w:t>
-      </w:r>
-    </w:p>
-    <w:bookmarkEnd w:id="23"/>
-    <w:bookmarkStart w:id="24" w:name="Xe50579c1b0af4f2f006a0c9b443e40ef526e21b"/>
-    <w:p>
-      <w:pPr>
-        <w:pStyle w:val="Heading3"/>
-      </w:pPr>
-      <w:r>
-        <w:t xml:space="preserve">Diapositiva 5 — La conclusión: un modelo de trabajo (0:35)</w:t>
-      </w:r>
-    </w:p>
-    <w:p>
-      <w:pPr>
-        <w:pStyle w:val="FirstParagraph"/>
-      </w:pPr>
-      <w:r>
-        <w:t xml:space="preserve">De ahí sale su modelo. El sistema 1 activa</w:t>
-      </w:r>
-      <w:r>
-        <w:t xml:space="preserve"> </w:t>
-      </w:r>
-      <w:r>
-        <w:rPr>
-          <w:bCs/>
-          <w:b/>
-        </w:rPr>
-        <w:t xml:space="preserve">varias intuiciones</w:t>
-      </w:r>
-      <w:r>
-        <w:t xml:space="preserve"> </w:t>
-      </w:r>
-      <w:r>
-        <w:t xml:space="preserve">de distinta fuerza, incluida la lógica. Un</w:t>
-      </w:r>
-      <w:r>
-        <w:t xml:space="preserve"> </w:t>
-      </w:r>
-      <w:r>
-        <w:rPr>
-          <w:bCs/>
-          <w:b/>
-        </w:rPr>
-        <w:t xml:space="preserve">monitoreo</w:t>
-      </w:r>
-      <w:r>
-        <w:t xml:space="preserve"> </w:t>
-      </w:r>
-      <w:r>
-        <w:t xml:space="preserve">intuitivo compara esas fuerzas: si son parecidas, la incertidumbre es alta y, pasado un umbral, se activa el sistema 2. La</w:t>
-      </w:r>
-      <w:r>
-        <w:t xml:space="preserve"> </w:t>
-      </w:r>
-      <w:r>
-        <w:rPr>
-          <w:bCs/>
-          <w:b/>
-        </w:rPr>
-        <w:t xml:space="preserve">deliberación</w:t>
-      </w:r>
-      <w:r>
-        <w:t xml:space="preserve"> </w:t>
-      </w:r>
-      <w:r>
-        <w:t xml:space="preserve">puede corregir, pero también solo justificar. Y una</w:t>
-      </w:r>
-      <w:r>
-        <w:t xml:space="preserve"> </w:t>
-      </w:r>
-      <w:r>
-        <w:rPr>
-          <w:bCs/>
-          <w:b/>
-        </w:rPr>
-        <w:t xml:space="preserve">retroalimentación</w:t>
-      </w:r>
-      <w:r>
-        <w:t xml:space="preserve"> </w:t>
-      </w:r>
-      <w:r>
-        <w:t xml:space="preserve">ajusta las intuiciones y apaga la deliberación cuando baja la incertidumbre. Conclusión: todo modelo dual viable tiene que ser</w:t>
-      </w:r>
-      <w:r>
-        <w:t xml:space="preserve"> </w:t>
-      </w:r>
-      <w:r>
-        <w:rPr>
-          <w:bCs/>
-          <w:b/>
-        </w:rPr>
-        <w:t xml:space="preserve">no exclusivo</w:t>
-      </w:r>
-      <w:r>
-        <w:t xml:space="preserve">.</w:t>
-      </w:r>
-    </w:p>
-    <w:p>
-      <w:pPr>
-        <w:pStyle w:val="BlockText"/>
-      </w:pPr>
-      <w:r>
-        <w:rPr>
-          <w:bCs/>
-          <w:b/>
-        </w:rPr>
-        <w:t xml:space="preserve">Si preguntan por la fórmula</w:t>
-      </w:r>
-      <w:r>
-        <w:t xml:space="preserve"> </w:t>
-      </w:r>
-      <w:r>
-        <w:t xml:space="preserve">(ejemplo nuestro, no del texto): U = 1 − |I1 − I2|. Si la intuición</w:t>
-      </w:r>
-      <w:r>
-        <w:t xml:space="preserve"> </w:t>
-      </w:r>
-      <w:r>
-        <w:t xml:space="preserve">“</w:t>
-      </w:r>
-      <w:r>
-        <w:t xml:space="preserve">10 centavos</w:t>
-      </w:r>
-      <w:r>
-        <w:t xml:space="preserve">”</w:t>
-      </w:r>
-      <w:r>
-        <w:t xml:space="preserve"> </w:t>
-      </w:r>
-      <w:r>
-        <w:t xml:space="preserve">tiene fuerza 0,8 y la de</w:t>
-      </w:r>
-      <w:r>
-        <w:t xml:space="preserve"> </w:t>
-      </w:r>
-      <w:r>
-        <w:t xml:space="preserve">“</w:t>
-      </w:r>
-      <w:r>
-        <w:t xml:space="preserve">5 centavos</w:t>
-      </w:r>
-      <w:r>
-        <w:t xml:space="preserve">”</w:t>
-      </w:r>
-      <w:r>
-        <w:t xml:space="preserve"> </w:t>
-      </w:r>
-      <w:r>
-        <w:t xml:space="preserve">0,3, U = 1 − 0,5 = 0,5. Si las dos valen 0,6, U = 1 − 0 = 1: máxima incertidumbre, y ahí se activa el sistema 2.</w:t>
-      </w:r>
-    </w:p>
-    <w:p>
-      <w:pPr>
-        <w:pStyle w:val="BlockText"/>
-      </w:pPr>
-      <w:r>
-        <w:rPr>
-          <w:bCs/>
-          <w:b/>
-        </w:rPr>
-        <w:t xml:space="preserve">Si preguntan por qué los modelos anteriores no explican el cambio:</w:t>
-      </w:r>
-      <w:r>
-        <w:t xml:space="preserve"> </w:t>
-      </w:r>
-      <w:r>
-        <w:t xml:space="preserve">si el sistema 2 vigila al 1, ya tendría que estar activo para detectar el conflicto; y un</w:t>
-      </w:r>
-      <w:r>
-        <w:t xml:space="preserve"> </w:t>
-      </w:r>
-      <w:r>
-        <w:t xml:space="preserve">“</w:t>
-      </w:r>
-      <w:r>
-        <w:t xml:space="preserve">sistema 3</w:t>
-      </w:r>
-      <w:r>
-        <w:t xml:space="preserve">”</w:t>
-      </w:r>
-      <w:r>
-        <w:t xml:space="preserve"> </w:t>
-      </w:r>
-      <w:r>
-        <w:t xml:space="preserve">que los compare lleva a una regresión infinita (De Neys, 2023a, pp. 6-7).</w:t>
+        <w:t xml:space="preserve">cuando hay conflicto.</w:t>
       </w:r>
     </w:p>
     <w:p>
@@ -1115,24 +922,209 @@
         </w:pict>
       </w:r>
     </w:p>
+    <w:bookmarkEnd w:id="23"/>
     <w:bookmarkEnd w:id="24"/>
+    <w:bookmarkStart w:id="27" w:name="Xbb310ec0982d6e4a0381782befa10762e6d4e91"/>
+    <w:p>
+      <w:pPr>
+        <w:pStyle w:val="Heading2"/>
+      </w:pPr>
+      <w:r>
+        <w:t xml:space="preserve">Expositor/a 2 — La propuesta y acierto 1: un mecanismo donde Evans no lo tenía (2:00)</w:t>
+      </w:r>
+    </w:p>
+    <w:bookmarkStart w:id="25" w:name="X3c2e2d5197895d4eec70611d9439f4040c215a4"/>
+    <w:p>
+      <w:pPr>
+        <w:pStyle w:val="Heading3"/>
+      </w:pPr>
+      <w:r>
+        <w:t xml:space="preserve">Diapositiva 5 — La propuesta: un modelo no exclusivo (0:35)</w:t>
+      </w:r>
+    </w:p>
+    <w:p>
+      <w:pPr>
+        <w:pStyle w:val="FirstParagraph"/>
+      </w:pPr>
+      <w:r>
+        <w:t xml:space="preserve">A partir de esos resultados, De Neys propone un modelo. El sistema 1 activa</w:t>
+      </w:r>
+      <w:r>
+        <w:t xml:space="preserve"> </w:t>
+      </w:r>
+      <w:r>
+        <w:rPr>
+          <w:bCs/>
+          <w:b/>
+        </w:rPr>
+        <w:t xml:space="preserve">varias intuiciones</w:t>
+      </w:r>
+      <w:r>
+        <w:t xml:space="preserve"> </w:t>
+      </w:r>
+      <w:r>
+        <w:t xml:space="preserve">de distinta fuerza, incluida la lógica. Un</w:t>
+      </w:r>
+      <w:r>
+        <w:t xml:space="preserve"> </w:t>
+      </w:r>
+      <w:r>
+        <w:rPr>
+          <w:bCs/>
+          <w:b/>
+        </w:rPr>
+        <w:t xml:space="preserve">monitoreo</w:t>
+      </w:r>
+      <w:r>
+        <w:t xml:space="preserve"> </w:t>
+      </w:r>
+      <w:r>
+        <w:t xml:space="preserve">intuitivo compara esas fuerzas: si son parecidas, la incertidumbre es alta y, pasado un umbral, se activa el sistema 2. La</w:t>
+      </w:r>
+      <w:r>
+        <w:t xml:space="preserve"> </w:t>
+      </w:r>
+      <w:r>
+        <w:rPr>
+          <w:bCs/>
+          <w:b/>
+        </w:rPr>
+        <w:t xml:space="preserve">deliberación</w:t>
+      </w:r>
+      <w:r>
+        <w:t xml:space="preserve"> </w:t>
+      </w:r>
+      <w:r>
+        <w:t xml:space="preserve">puede corregir, pero también solo justificar. Y una</w:t>
+      </w:r>
+      <w:r>
+        <w:t xml:space="preserve"> </w:t>
+      </w:r>
+      <w:r>
+        <w:rPr>
+          <w:bCs/>
+          <w:b/>
+        </w:rPr>
+        <w:t xml:space="preserve">retroalimentación</w:t>
+      </w:r>
+      <w:r>
+        <w:t xml:space="preserve"> </w:t>
+      </w:r>
+      <w:r>
+        <w:t xml:space="preserve">ajusta las intuiciones y apaga la deliberación. Conclusión: todo modelo dual viable tiene que ser</w:t>
+      </w:r>
+      <w:r>
+        <w:t xml:space="preserve"> </w:t>
+      </w:r>
+      <w:r>
+        <w:rPr>
+          <w:bCs/>
+          <w:b/>
+        </w:rPr>
+        <w:t xml:space="preserve">no exclusivo</w:t>
+      </w:r>
+      <w:r>
+        <w:t xml:space="preserve">.</w:t>
+      </w:r>
+    </w:p>
+    <w:p>
+      <w:pPr>
+        <w:pStyle w:val="BlockText"/>
+      </w:pPr>
+      <w:r>
+        <w:rPr>
+          <w:bCs/>
+          <w:b/>
+        </w:rPr>
+        <w:t xml:space="preserve">Si preguntan por la fórmula</w:t>
+      </w:r>
+      <w:r>
+        <w:t xml:space="preserve"> </w:t>
+      </w:r>
+      <w:r>
+        <w:t xml:space="preserve">(ejemplo nuestro, no del texto): U = 1 − |I1 − I2|. Si la intuición</w:t>
+      </w:r>
+      <w:r>
+        <w:t xml:space="preserve"> </w:t>
+      </w:r>
+      <w:r>
+        <w:t xml:space="preserve">“</w:t>
+      </w:r>
+      <w:r>
+        <w:t xml:space="preserve">10 centavos</w:t>
+      </w:r>
+      <w:r>
+        <w:t xml:space="preserve">”</w:t>
+      </w:r>
+      <w:r>
+        <w:t xml:space="preserve"> </w:t>
+      </w:r>
+      <w:r>
+        <w:t xml:space="preserve">tiene fuerza 0,8 y la de</w:t>
+      </w:r>
+      <w:r>
+        <w:t xml:space="preserve"> </w:t>
+      </w:r>
+      <w:r>
+        <w:t xml:space="preserve">“</w:t>
+      </w:r>
+      <w:r>
+        <w:t xml:space="preserve">5 centavos</w:t>
+      </w:r>
+      <w:r>
+        <w:t xml:space="preserve">”</w:t>
+      </w:r>
+      <w:r>
+        <w:t xml:space="preserve"> </w:t>
+      </w:r>
+      <w:r>
+        <w:t xml:space="preserve">0,3, U = 1 − 0,5 = 0,5. Si las dos valen 0,6, U = 1 − 0 = 1: máxima incertidumbre, y ahí se activa el sistema 2.</w:t>
+      </w:r>
+    </w:p>
+    <w:p>
+      <w:pPr>
+        <w:pStyle w:val="BlockText"/>
+      </w:pPr>
+      <w:r>
+        <w:rPr>
+          <w:bCs/>
+          <w:b/>
+        </w:rPr>
+        <w:t xml:space="preserve">Si preguntan por qué los modelos anteriores no explican el cambio:</w:t>
+      </w:r>
+      <w:r>
+        <w:t xml:space="preserve"> </w:t>
+      </w:r>
+      <w:r>
+        <w:t xml:space="preserve">si el sistema 2 vigila al 1, ya tendría que estar activo para detectar el conflicto; y un</w:t>
+      </w:r>
+      <w:r>
+        <w:t xml:space="preserve"> </w:t>
+      </w:r>
+      <w:r>
+        <w:t xml:space="preserve">“</w:t>
+      </w:r>
+      <w:r>
+        <w:t xml:space="preserve">sistema 3</w:t>
+      </w:r>
+      <w:r>
+        <w:t xml:space="preserve">”</w:t>
+      </w:r>
+      <w:r>
+        <w:t xml:space="preserve"> </w:t>
+      </w:r>
+      <w:r>
+        <w:t xml:space="preserve">que los compare lleva a una regresión infinita (De Neys, 2023a, pp. 6-7).</w:t>
+      </w:r>
+    </w:p>
     <w:bookmarkEnd w:id="25"/>
-    <w:bookmarkStart w:id="27" w:name="Xa2ecce2f662390e2aa20f1095197c8c9649bb16"/>
-    <w:p>
-      <w:pPr>
-        <w:pStyle w:val="Heading2"/>
-      </w:pPr>
-      <w:r>
-        <w:t xml:space="preserve">Expositor/a 2 — Acierto 1: un mecanismo donde Evans no lo tenía (1:25)</w:t>
-      </w:r>
-    </w:p>
-    <w:bookmarkStart w:id="26" w:name="diapositiva-6"/>
+    <w:bookmarkStart w:id="26" w:name="diapositiva-6-acierto-1-125"/>
     <w:p>
       <w:pPr>
         <w:pStyle w:val="Heading3"/>
       </w:pPr>
       <w:r>
-        <w:t xml:space="preserve">Diapositiva 6</w:t>
+        <w:t xml:space="preserve">Diapositiva 6 — Acierto 1 (1:25)</w:t>
       </w:r>
     </w:p>
     <w:p>
@@ -1140,20 +1132,112 @@
         <w:pStyle w:val="FirstParagraph"/>
       </w:pPr>
       <w:r>
-        <w:t xml:space="preserve">El primer acierto es que De Neys</w:t>
-      </w:r>
-      <w:r>
-        <w:t xml:space="preserve"> </w:t>
-      </w:r>
-      <w:r>
-        <w:rPr>
-          <w:bCs/>
-          <w:b/>
-        </w:rPr>
-        <w:t xml:space="preserve">hace explícito un supuesto que vimos en la materia</w:t>
-      </w:r>
-      <w:r>
-        <w:t xml:space="preserve">: el de la teoría heurístico-analítica de Evans.</w:t>
+        <w:t xml:space="preserve">El primer acierto es que hace explícito un supuesto que vimos en la materia: el de la teoría heurístico-analítica de Evans. Para Evans hay un estadio</w:t>
+      </w:r>
+      <w:r>
+        <w:t xml:space="preserve"> </w:t>
+      </w:r>
+      <w:r>
+        <w:rPr>
+          <w:bCs/>
+          <w:b/>
+        </w:rPr>
+        <w:t xml:space="preserve">heurístico</w:t>
+      </w:r>
+      <w:r>
+        <w:t xml:space="preserve">, preconsciente, que selecciona la información relevante, y uno</w:t>
+      </w:r>
+      <w:r>
+        <w:t xml:space="preserve"> </w:t>
+      </w:r>
+      <w:r>
+        <w:rPr>
+          <w:bCs/>
+          <w:b/>
+        </w:rPr>
+        <w:t xml:space="preserve">analítico</w:t>
+      </w:r>
+      <w:r>
+        <w:t xml:space="preserve">, donde se deduce. Los</w:t>
+      </w:r>
+      <w:r>
+        <w:t xml:space="preserve"> </w:t>
+      </w:r>
+      <w:r>
+        <w:rPr>
+          <w:bCs/>
+          <w:b/>
+        </w:rPr>
+        <w:t xml:space="preserve">sesgos</w:t>
+      </w:r>
+      <w:r>
+        <w:t xml:space="preserve"> </w:t>
+      </w:r>
+      <w:r>
+        <w:t xml:space="preserve">se atribuyen al primero y la</w:t>
+      </w:r>
+      <w:r>
+        <w:t xml:space="preserve"> </w:t>
+      </w:r>
+      <w:r>
+        <w:rPr>
+          <w:bCs/>
+          <w:b/>
+        </w:rPr>
+        <w:t xml:space="preserve">competencia</w:t>
+      </w:r>
+      <w:r>
+        <w:t xml:space="preserve">, al segundo (Valiña y Martín, 2014, pp. 19-20, 22). Esa es justamente la exclusividad, y De Neys muestra lo que a Evans le faltaba:</w:t>
+      </w:r>
+      <w:r>
+        <w:t xml:space="preserve"> </w:t>
+      </w:r>
+      <w:r>
+        <w:rPr>
+          <w:bCs/>
+          <w:b/>
+        </w:rPr>
+        <w:t xml:space="preserve">qué hace que intervenga</w:t>
+      </w:r>
+      <w:r>
+        <w:t xml:space="preserve"> </w:t>
+      </w:r>
+      <w:r>
+        <w:t xml:space="preserve">lo analítico. Además, que deliberar a veces solo</w:t>
+      </w:r>
+      <w:r>
+        <w:t xml:space="preserve"> </w:t>
+      </w:r>
+      <w:r>
+        <w:rPr>
+          <w:bCs/>
+          <w:b/>
+        </w:rPr>
+        <w:t xml:space="preserve">justifique</w:t>
+      </w:r>
+      <w:r>
+        <w:t xml:space="preserve"> </w:t>
+      </w:r>
+      <w:r>
+        <w:t xml:space="preserve">la intuición coincide con Evans:</w:t>
+      </w:r>
+      <w:r>
+        <w:t xml:space="preserve"> </w:t>
+      </w:r>
+      <w:r>
+        <w:t xml:space="preserve">“</w:t>
+      </w:r>
+      <w:r>
+        <w:t xml:space="preserve">las personas cometen errores en razonamiento porque piensan selectivamente</w:t>
+      </w:r>
+      <w:r>
+        <w:t xml:space="preserve">”</w:t>
+      </w:r>
+      <w:r>
+        <w:t xml:space="preserve"> </w:t>
+      </w:r>
+      <w:r>
+        <w:t xml:space="preserve">(Valiña y Martín, 2014, p. 20). Por ejemplo, alguien puede deliberar solo para encontrar razones a favor de los 10 centavos.</w:t>
       </w:r>
     </w:p>
     <w:p>
@@ -1161,122 +1245,6 @@
         <w:pStyle w:val="BodyText"/>
       </w:pPr>
       <w:r>
-        <w:t xml:space="preserve">Para Evans, el razonamiento tiene un estadio</w:t>
-      </w:r>
-      <w:r>
-        <w:t xml:space="preserve"> </w:t>
-      </w:r>
-      <w:r>
-        <w:rPr>
-          <w:bCs/>
-          <w:b/>
-        </w:rPr>
-        <w:t xml:space="preserve">heurístico</w:t>
-      </w:r>
-      <w:r>
-        <w:t xml:space="preserve">, preconsciente y rápido, que selecciona la información relevante, y un estadio</w:t>
-      </w:r>
-      <w:r>
-        <w:t xml:space="preserve"> </w:t>
-      </w:r>
-      <w:r>
-        <w:rPr>
-          <w:bCs/>
-          <w:b/>
-        </w:rPr>
-        <w:t xml:space="preserve">analítico</w:t>
-      </w:r>
-      <w:r>
-        <w:t xml:space="preserve">, donde se deduce. Los</w:t>
-      </w:r>
-      <w:r>
-        <w:t xml:space="preserve"> </w:t>
-      </w:r>
-      <w:r>
-        <w:rPr>
-          <w:bCs/>
-          <w:b/>
-        </w:rPr>
-        <w:t xml:space="preserve">sesgos</w:t>
-      </w:r>
-      <w:r>
-        <w:t xml:space="preserve"> </w:t>
-      </w:r>
-      <w:r>
-        <w:t xml:space="preserve">se atribuyen al primero y la</w:t>
-      </w:r>
-      <w:r>
-        <w:t xml:space="preserve"> </w:t>
-      </w:r>
-      <w:r>
-        <w:rPr>
-          <w:bCs/>
-          <w:b/>
-        </w:rPr>
-        <w:t xml:space="preserve">competencia</w:t>
-      </w:r>
-      <w:r>
-        <w:t xml:space="preserve"> </w:t>
-      </w:r>
-      <w:r>
-        <w:t xml:space="preserve">lógica, al segundo (Valiña y Martín, 2014, pp. 19-20, 22). Esa es justamente la exclusividad que critica De Neys, y su crítica muestra lo que a Evans le faltaba:</w:t>
-      </w:r>
-      <w:r>
-        <w:t xml:space="preserve"> </w:t>
-      </w:r>
-      <w:r>
-        <w:rPr>
-          <w:bCs/>
-          <w:b/>
-        </w:rPr>
-        <w:t xml:space="preserve">qué hace que intervenga</w:t>
-      </w:r>
-      <w:r>
-        <w:t xml:space="preserve"> </w:t>
-      </w:r>
-      <w:r>
-        <w:t xml:space="preserve">el estadio analítico. Además, que la deliberación muchas veces</w:t>
-      </w:r>
-      <w:r>
-        <w:t xml:space="preserve"> </w:t>
-      </w:r>
-      <w:r>
-        <w:rPr>
-          <w:bCs/>
-          <w:b/>
-        </w:rPr>
-        <w:t xml:space="preserve">justifique</w:t>
-      </w:r>
-      <w:r>
-        <w:t xml:space="preserve"> </w:t>
-      </w:r>
-      <w:r>
-        <w:t xml:space="preserve">la intuición en vez de corregirla coincide con Evans:</w:t>
-      </w:r>
-      <w:r>
-        <w:t xml:space="preserve"> </w:t>
-      </w:r>
-      <w:r>
-        <w:t xml:space="preserve">“</w:t>
-      </w:r>
-      <w:r>
-        <w:t xml:space="preserve">las personas cometen errores en razonamiento porque piensan selectivamente</w:t>
-      </w:r>
-      <w:r>
-        <w:t xml:space="preserve">”</w:t>
-      </w:r>
-      <w:r>
-        <w:t xml:space="preserve"> </w:t>
-      </w:r>
-      <w:r>
-        <w:t xml:space="preserve">(Valiña y Martín, 2014, p. 20).</w:t>
-      </w:r>
-    </w:p>
-    <w:p>
-      <w:pPr>
-        <w:pStyle w:val="BodyText"/>
-      </w:pPr>
-      <w:r>
         <w:t xml:space="preserve">Hay un segundo aporte. A Tversky y Kahneman se les criticó que su teoría es</w:t>
       </w:r>
       <w:r>
@@ -1290,7 +1258,10 @@
         <w:t xml:space="preserve">más descriptiva que explicativa</w:t>
       </w:r>
       <w:r>
-        <w:t xml:space="preserve">: describen fenómenos, pero no los procesos que los producen (Pérez Echeverría y Bautista, 2014, p. 18). De Neys hace lo contrario: propone un</w:t>
+        <w:t xml:space="preserve"> </w:t>
+      </w:r>
+      <w:r>
+        <w:t xml:space="preserve">(Pérez Echeverría y Bautista, 2014, p. 18). De Neys, en cambio, propone un</w:t>
       </w:r>
       <w:r>
         <w:t xml:space="preserve"> </w:t>
@@ -1306,7 +1277,7 @@
         <w:t xml:space="preserve"> </w:t>
       </w:r>
       <w:r>
-        <w:t xml:space="preserve">—fuerza de las intuiciones, incertidumbre, umbral y retroalimentación— del que salen preguntas nuevas que se pueden poner a prueba.</w:t>
+        <w:t xml:space="preserve">—fuerza de las intuiciones, incertidumbre, umbral y retroalimentación— del que salen preguntas que se pueden poner a prueba.</w:t>
       </w:r>
     </w:p>
     <w:p>
@@ -1318,13 +1289,13 @@
     </w:p>
     <w:bookmarkEnd w:id="26"/>
     <w:bookmarkEnd w:id="27"/>
-    <w:bookmarkStart w:id="29" w:name="X0b6e39787c8df71c873659320a90bd1c7ef9d0b"/>
+    <w:bookmarkStart w:id="29" w:name="X5df62c6deeebd5ced2292d59a1ffd565de34b2c"/>
     <w:p>
       <w:pPr>
         <w:pStyle w:val="Heading2"/>
       </w:pPr>
       <w:r>
-        <w:t xml:space="preserve">Expositor/a 3 — Acierto 2: la intuición se educa (1:20)</w:t>
+        <w:t xml:space="preserve">Expositor/a 3 — Acierto 2: la intuición se educa (2:00)</w:t>
       </w:r>
     </w:p>
     <w:bookmarkStart w:id="28" w:name="diapositiva-7"/>
@@ -1401,7 +1372,7 @@
         <w:t xml:space="preserve">secundarias</w:t>
       </w:r>
       <w:r>
-        <w:t xml:space="preserve">, logradas por instrucción y esfuerzo deliberado. Y</w:t>
+        <w:t xml:space="preserve">, que se logran por instrucción y esfuerzo deliberado.</w:t>
       </w:r>
       <w:r>
         <w:t xml:space="preserve"> </w:t>
@@ -1417,7 +1388,7 @@
         <w:t xml:space="preserve"> </w:t>
       </w:r>
       <w:r>
-        <w:t xml:space="preserve">dice que la intuición se puede</w:t>
+        <w:t xml:space="preserve">agrega que la intuición se puede y se debe</w:t>
       </w:r>
       <w:r>
         <w:t xml:space="preserve"> </w:t>
@@ -1433,7 +1404,7 @@
         <w:t xml:space="preserve"> </w:t>
       </w:r>
       <w:r>
-        <w:t xml:space="preserve">hasta acercarse a la norma estadística (Pérez Echeverría y Bautista, 2014, pp. 7-8, 18). Los expertos, además, convierten lo deliberado en tácito (p. 20). La</w:t>
+        <w:t xml:space="preserve">hasta acercarse a la norma estadística (Pérez Echeverría y Bautista, 2014, pp. 7-8, 18). Y los expertos convierten lo deliberado en tácito: automatizan decisiones que antes les costaban (p. 20). Lo que para el novato es un problema, para el experto es un ejercicio (Pérez Echeverría, 2014, p. 16). Pensemos en un estudiante que al principio calcula una probabilidad paso a paso y, con práctica, la estima de un vistazo. La</w:t>
       </w:r>
       <w:r>
         <w:t xml:space="preserve"> </w:t>
@@ -1451,7 +1422,7 @@
         <w:t xml:space="preserve"> </w:t>
       </w:r>
       <w:r>
-        <w:t xml:space="preserve">de De Neys sería una intuición secundaria.</w:t>
+        <w:t xml:space="preserve">de De Neys sería, en estos términos, una intuición secundaria.</w:t>
       </w:r>
     </w:p>
     <w:p>
@@ -1488,7 +1459,7 @@
         <w:t xml:space="preserve"> </w:t>
       </w:r>
       <w:r>
-        <w:t xml:space="preserve">(Pérez Echeverría y Bautista, 2014, pp. 18-19). De Neys combina tiempos, confianza, respuestas bajo carga y justificaciones. Y sus datos muestran que lo implícito cuesta declararse: las respuestas correctas intuitivas son difíciles de justificar (De Neys, 2023a, p. 12).</w:t>
+        <w:t xml:space="preserve">(Pérez Echeverría y Bautista, 2014, pp. 18-19). De Neys combina cuatro: tiempos de respuesta, confianza, respuestas bajo carga y justificaciones. Y sus datos muestran justamente que lo implícito cuesta declararse: las respuestas correctas intuitivas son difíciles de justificar, a diferencia de las deliberadas (De Neys, 2023a, p. 12).</w:t>
       </w:r>
     </w:p>
     <w:p>
@@ -1496,7 +1467,7 @@
         <w:pStyle w:val="BodyText"/>
       </w:pPr>
       <w:r>
-        <w:t xml:space="preserve">Pero el modelo también tiene puntos débiles.</w:t>
+        <w:t xml:space="preserve">Pero el modelo también tiene puntos débiles, y de eso van a hablar mis compañeros.</w:t>
       </w:r>
     </w:p>
     <w:p>
@@ -1508,13 +1479,13 @@
     </w:p>
     <w:bookmarkEnd w:id="28"/>
     <w:bookmarkEnd w:id="29"/>
-    <w:bookmarkStart w:id="31" w:name="X5f998dbda0ab44171c797fbeed1062eae67f602"/>
+    <w:bookmarkStart w:id="31" w:name="Xbac7f14e1b401221c17f7c4d9db0a296d3169e9"/>
     <w:p>
       <w:pPr>
         <w:pStyle w:val="Heading2"/>
       </w:pPr>
       <w:r>
-        <w:t xml:space="preserve">Expositor/a 4 — Crítica 1: ¿umbral o continuo? (1:40)</w:t>
+        <w:t xml:space="preserve">Expositor/a 4 — Crítica 1: ¿umbral o continuo? (2:00)</w:t>
       </w:r>
     </w:p>
     <w:bookmarkStart w:id="30" w:name="diapositiva-8"/>
@@ -1560,7 +1531,7 @@
         <w:t xml:space="preserve"> </w:t>
       </w:r>
       <w:r>
-        <w:t xml:space="preserve">que las separe, así que nunca se puede descartar algo de deliberación en la respuesta rápida (De Neys, 2023a, p. 5). Y su argumento depende de que esa respuesta sea pura intuición.</w:t>
+        <w:t xml:space="preserve">que las separe, así que nunca se puede descartar algo de deliberación en la respuesta rápida (De Neys, 2023a, p. 5). Pensemos en el bate y la pelota: si alguien responde en dos segundos, ¿cómo sabemos que no pensó un poco? Y todo su argumento depende de que esa primera respuesta sea pura intuición.</w:t>
       </w:r>
     </w:p>
     <w:p>
@@ -1673,13 +1644,13 @@
     </w:p>
     <w:bookmarkEnd w:id="30"/>
     <w:bookmarkEnd w:id="31"/>
-    <w:bookmarkStart w:id="34" w:name="expositora-5-crítica-2-y-cierre-210"/>
+    <w:bookmarkStart w:id="34" w:name="expositora-5-crítica-2-y-cierre-200"/>
     <w:p>
       <w:pPr>
         <w:pStyle w:val="Heading2"/>
       </w:pPr>
       <w:r>
-        <w:t xml:space="preserve">Expositor/a 5 — Crítica 2 y cierre (2:10)</w:t>
+        <w:t xml:space="preserve">Expositor/a 5 — Crítica 2 y cierre (2:00)</w:t>
       </w:r>
     </w:p>
     <w:bookmarkStart w:id="32" w:name="X7756be326a471f0fd6fd0376dece5b32e059d09"/>
@@ -1781,7 +1752,91 @@
         <w:t xml:space="preserve"> </w:t>
       </w:r>
       <w:r>
-        <w:t xml:space="preserve">(Pérez Echeverría y Bautista, 2014, p. 16). Evans diría que una cosa es la racionalidad</w:t>
+        <w:t xml:space="preserve">(Pérez Echeverría y Bautista, 2014, p. 16). Entonces, ¿qué pasa con el modelo en los problemas mal definidos de la vida cotidiana, donde no hay respuesta correcta contra la cual medir? El autor lo admite como límite (De Neys, 2023b, p. 68).</w:t>
+      </w:r>
+    </w:p>
+    <w:p>
+      <w:pPr>
+        <w:pStyle w:val="BodyText"/>
+      </w:pPr>
+      <w:r>
+        <w:t xml:space="preserve">Además, que la lógica se automatice</w:t>
+      </w:r>
+      <w:r>
+        <w:t xml:space="preserve"> </w:t>
+      </w:r>
+      <w:r>
+        <w:rPr>
+          <w:bCs/>
+          <w:b/>
+        </w:rPr>
+        <w:t xml:space="preserve">tiene poca evidencia directa</w:t>
+      </w:r>
+      <w:r>
+        <w:t xml:space="preserve"> </w:t>
+      </w:r>
+      <w:r>
+        <w:t xml:space="preserve">(De Neys, 2023a, p. 13), y el autor no usa la tradición de Fischbein, que podría darle sustento.</w:t>
+      </w:r>
+    </w:p>
+    <w:p>
+      <w:pPr>
+        <w:pStyle w:val="BlockText"/>
+      </w:pPr>
+      <w:r>
+        <w:rPr>
+          <w:bCs/>
+          <w:b/>
+        </w:rPr>
+        <w:t xml:space="preserve">Si preguntan qué sería</w:t>
+      </w:r>
+      <w:r>
+        <w:rPr>
+          <w:bCs/>
+          <w:b/>
+        </w:rPr>
+        <w:t xml:space="preserve"> </w:t>
+      </w:r>
+      <w:r>
+        <w:rPr>
+          <w:bCs/>
+          <w:b/>
+        </w:rPr>
+        <w:t xml:space="preserve">“</w:t>
+      </w:r>
+      <w:r>
+        <w:rPr>
+          <w:bCs/>
+          <w:b/>
+        </w:rPr>
+        <w:t xml:space="preserve">acertar</w:t>
+      </w:r>
+      <w:r>
+        <w:rPr>
+          <w:bCs/>
+          <w:b/>
+        </w:rPr>
+        <w:t xml:space="preserve">”</w:t>
+      </w:r>
+      <w:r>
+        <w:rPr>
+          <w:bCs/>
+          <w:b/>
+        </w:rPr>
+        <w:t xml:space="preserve"> </w:t>
+      </w:r>
+      <w:r>
+        <w:rPr>
+          <w:bCs/>
+          <w:b/>
+        </w:rPr>
+        <w:t xml:space="preserve">fuera del laboratorio:</w:t>
+      </w:r>
+      <w:r>
+        <w:t xml:space="preserve"> </w:t>
+      </w:r>
+      <w:r>
+        <w:t xml:space="preserve">Evans distingue la racionalidad</w:t>
       </w:r>
       <w:r>
         <w:t xml:space="preserve"> </w:t>
@@ -1794,7 +1849,7 @@
         <w:t xml:space="preserve">de proceso</w:t>
       </w:r>
       <w:r>
-        <w:t xml:space="preserve">, ajustarse a la norma, y otra la</w:t>
+        <w:t xml:space="preserve">, ajustarse a una norma como la lógica, de la racionalidad</w:t>
       </w:r>
       <w:r>
         <w:t xml:space="preserve"> </w:t>
@@ -1807,41 +1862,17 @@
         <w:t xml:space="preserve">de propósito</w:t>
       </w:r>
       <w:r>
-        <w:t xml:space="preserve">, alcanzar los propios objetivos (Valiña y Martín, 2014, p. 21). Entonces, ¿qué pasa con el modelo en los problemas mal definidos de la vida cotidiana, donde no hay respuesta correcta contra la cual medir? El autor lo admite como límite (De Neys, 2023b, p. 68).</w:t>
-      </w:r>
-    </w:p>
-    <w:p>
-      <w:pPr>
-        <w:pStyle w:val="BodyText"/>
-      </w:pPr>
-      <w:r>
-        <w:t xml:space="preserve">Además, que la lógica se automatice</w:t>
-      </w:r>
-      <w:r>
-        <w:t xml:space="preserve"> </w:t>
-      </w:r>
-      <w:r>
-        <w:rPr>
-          <w:bCs/>
-          <w:b/>
-        </w:rPr>
-        <w:t xml:space="preserve">tiene poca evidencia directa</w:t>
-      </w:r>
-      <w:r>
-        <w:t xml:space="preserve"> </w:t>
-      </w:r>
-      <w:r>
-        <w:t xml:space="preserve">(De Neys, 2023a, p. 13), y el autor no usa la tradición de Fischbein, que podría darle sustento.</w:t>
+        <w:t xml:space="preserve">, alcanzar los propios objetivos (Valiña y Martín, 2014, p. 21). En la vida cotidiana importa la segunda, y el modelo solo mide la primera.</w:t>
       </w:r>
     </w:p>
     <w:bookmarkEnd w:id="32"/>
-    <w:bookmarkStart w:id="33" w:name="diapositiva-10-conclusión-y-debate-050"/>
+    <w:bookmarkStart w:id="33" w:name="diapositiva-10-conclusión-y-debate-040"/>
     <w:p>
       <w:pPr>
         <w:pStyle w:val="Heading3"/>
       </w:pPr>
       <w:r>
-        <w:t xml:space="preserve">Diapositiva 10 — Conclusión y debate (0:50)</w:t>
+        <w:t xml:space="preserve">Diapositiva 10 — Conclusión y debate (0:40)</w:t>
       </w:r>
     </w:p>
     <w:p>

</xml_diff>

<commit_message>
Procesos Básicos III: una parte por expositor en la presentación de De Neys
Cada expositor presenta solo su parte durante 2 minutos: 1 el
experimento, 2 y 3 los aciertos, 4 y 5 las críticas. El modelo de De
Neys pasa a ser el contenido del acierto 1, y la crítica 2 recupera el
argumento de Evans sobre racionalidad de proceso y de propósito. El cierre
y la pregunta de la diapositiva 10 quedan para el debate de todo el grupo,
después de la exposición, como pide la consigna.

Co-Authored-By: Claude Opus 5.5 <noreply@anthropic.com>
Claude-Session: https://claude.ai/code/session_014TgNuKp3tg1RihixbZ4R3r
</commit_message>
<xml_diff>
--- a/2do Año/Procesos Básicos III/6_Entregables/U03_PresentacionArticulo_FastAndSlowThinking_Guion.docx
+++ b/2do Año/Procesos Básicos III/6_Entregables/U03_PresentacionArticulo_FastAndSlowThinking_Guion.docx
@@ -2,7 +2,7 @@
 <file path=word/document.xml><?xml version="1.0" encoding="utf-8"?>
 <w:document xmlns:w="http://schemas.openxmlformats.org/wordprocessingml/2006/main" xmlns:m="http://schemas.openxmlformats.org/officeDocument/2006/math" xmlns:r="http://schemas.openxmlformats.org/officeDocument/2006/relationships" xmlns:o="urn:schemas-microsoft-com:office:office" xmlns:v="urn:schemas-microsoft-com:vml" xmlns:w10="urn:schemas-microsoft-com:office:word" xmlns:a="http://schemas.openxmlformats.org/drawingml/2006/main" xmlns:pic="http://schemas.openxmlformats.org/drawingml/2006/picture" xmlns:wp="http://schemas.openxmlformats.org/drawingml/2006/wordprocessingDrawing">
   <w:body>
-    <w:bookmarkStart w:id="37" w:name="X3381f16390f771b482be7ebc3b196b0487627de"/>
+    <w:bookmarkStart w:id="38" w:name="X3381f16390f771b482be7ebc3b196b0487627de"/>
     <w:p>
       <w:pPr>
         <w:pStyle w:val="Heading1"/>
@@ -42,7 +42,20 @@
         <w:t xml:space="preserve"> </w:t>
       </w:r>
       <w:r>
-        <w:t xml:space="preserve">Cada parte tiene unas 250 palabras, que a ritmo de exposición (unas 130 por minuto) dan 1:55. Esos segundos de margen son para pasar de una diapositiva a otra y para cambiar de expositor. Ensayen con cronómetro. Las notas en recuadro («Si preguntan…»)</w:t>
+        <w:t xml:space="preserve">Cada parte tiene unas 250 palabras, que a ritmo de exposición (unas 130 por minuto) dan 1:55. Esos segundos de margen son para pasar de una diapositiva a otra y para cambiar de expositor.</w:t>
+      </w:r>
+      <w:r>
+        <w:t xml:space="preserve"> </w:t>
+      </w:r>
+      <w:r>
+        <w:rPr>
+          <w:bCs/>
+          <w:b/>
+        </w:rPr>
+        <w:t xml:space="preserve">El debate va después de los 10 minutos</w:t>
+      </w:r>
+      <w:r>
+        <w:t xml:space="preserve">, como pide la consigna («Luego de la presentación, el grupo deberá propiciar un debate»), y lo abre el grupo con la diapositiva 10. Ensayen con cronómetro. Las notas en recuadro («Si preguntan…»)</w:t>
       </w:r>
       <w:r>
         <w:t xml:space="preserve"> </w:t>
@@ -220,7 +233,7 @@
               <w:jc w:val="left"/>
             </w:pPr>
             <w:r>
-              <w:t xml:space="preserve">La propuesta del autor y acierto 1: un mecanismo donde Evans no lo tenía</w:t>
+              <w:t xml:space="preserve">Acierto 1: un mecanismo donde Evans no lo tenía</w:t>
             </w:r>
           </w:p>
         </w:tc>
@@ -406,19 +419,19 @@
               <w:jc w:val="left"/>
             </w:pPr>
             <w:r>
-              <w:t xml:space="preserve">Crítica 2 y cierre con la pregunta para el debate</w:t>
-            </w:r>
-          </w:p>
-        </w:tc>
-        <w:tc>
-          <w:tcPr/>
-          <w:p>
-            <w:pPr>
-              <w:pStyle w:val="Compact"/>
-              <w:jc w:val="left"/>
-            </w:pPr>
-            <w:r>
-              <w:t xml:space="preserve">9-10</w:t>
+              <w:t xml:space="preserve">Crítica 2: del laboratorio a la vida real</w:t>
+            </w:r>
+          </w:p>
+        </w:tc>
+        <w:tc>
+          <w:tcPr/>
+          <w:p>
+            <w:pPr>
+              <w:pStyle w:val="Compact"/>
+              <w:jc w:val="left"/>
+            </w:pPr>
+            <w:r>
+              <w:t xml:space="preserve">9</w:t>
             </w:r>
           </w:p>
         </w:tc>
@@ -443,6 +456,68 @@
             </w:pPr>
             <w:r>
               <w:t xml:space="preserve">10:00</w:t>
+            </w:r>
+          </w:p>
+        </w:tc>
+      </w:tr>
+      <w:tr>
+        <w:tc>
+          <w:tcPr/>
+          <w:p>
+            <w:pPr>
+              <w:pStyle w:val="Compact"/>
+              <w:jc w:val="left"/>
+            </w:pPr>
+            <w:r>
+              <w:t xml:space="preserve">Todo el grupo</w:t>
+            </w:r>
+          </w:p>
+        </w:tc>
+        <w:tc>
+          <w:tcPr/>
+          <w:p>
+            <w:pPr>
+              <w:pStyle w:val="Compact"/>
+              <w:jc w:val="left"/>
+            </w:pPr>
+            <w:r>
+              <w:t xml:space="preserve">Debate (después de la exposición)</w:t>
+            </w:r>
+          </w:p>
+        </w:tc>
+        <w:tc>
+          <w:tcPr/>
+          <w:p>
+            <w:pPr>
+              <w:pStyle w:val="Compact"/>
+              <w:jc w:val="left"/>
+            </w:pPr>
+            <w:r>
+              <w:t xml:space="preserve">10</w:t>
+            </w:r>
+          </w:p>
+        </w:tc>
+        <w:tc>
+          <w:tcPr/>
+          <w:p>
+            <w:pPr>
+              <w:pStyle w:val="Compact"/>
+              <w:jc w:val="left"/>
+            </w:pPr>
+            <w:r>
+              <w:t xml:space="preserve">—</w:t>
+            </w:r>
+          </w:p>
+        </w:tc>
+        <w:tc>
+          <w:tcPr/>
+          <w:p>
+            <w:pPr>
+              <w:pStyle w:val="Compact"/>
+              <w:jc w:val="left"/>
+            </w:pPr>
+            <w:r>
+              <w:t xml:space="preserve">—</w:t>
             </w:r>
           </w:p>
         </w:tc>
@@ -644,7 +719,7 @@
         <w:t xml:space="preserve">Behavioral and Brain Sciences</w:t>
       </w:r>
       <w:r>
-        <w:t xml:space="preserve">. Yo les cuento cómo se investigó; después vienen la propuesta, los aciertos y las críticas.</w:t>
+        <w:t xml:space="preserve">. Yo les cuento cómo se investigó; después mis compañeros presentan dos aciertos y dos críticas teóricas.</w:t>
       </w:r>
     </w:p>
     <w:bookmarkEnd w:id="20"/>
@@ -924,22 +999,22 @@
     </w:p>
     <w:bookmarkEnd w:id="23"/>
     <w:bookmarkEnd w:id="24"/>
-    <w:bookmarkStart w:id="27" w:name="Xbb310ec0982d6e4a0381782befa10762e6d4e91"/>
+    <w:bookmarkStart w:id="27" w:name="Xb0647830d59b02ab9cb35fb526aab8d1ac14668"/>
     <w:p>
       <w:pPr>
         <w:pStyle w:val="Heading2"/>
       </w:pPr>
       <w:r>
-        <w:t xml:space="preserve">Expositor/a 2 — La propuesta y acierto 1: un mecanismo donde Evans no lo tenía (2:00)</w:t>
-      </w:r>
-    </w:p>
-    <w:bookmarkStart w:id="25" w:name="X3c2e2d5197895d4eec70611d9439f4040c215a4"/>
+        <w:t xml:space="preserve">Expositor/a 2 — Acierto 1: un mecanismo donde Evans no lo tenía (2:00)</w:t>
+      </w:r>
+    </w:p>
+    <w:bookmarkStart w:id="25" w:name="X2d02ef62b9036d6a28c5d2ff5652c56237df691"/>
     <w:p>
       <w:pPr>
         <w:pStyle w:val="Heading3"/>
       </w:pPr>
       <w:r>
-        <w:t xml:space="preserve">Diapositiva 5 — La propuesta: un modelo no exclusivo (0:35)</w:t>
+        <w:t xml:space="preserve">Diapositiva 5 — El mecanismo que propone De Neys (0:45)</w:t>
       </w:r>
     </w:p>
     <w:p>
@@ -947,7 +1022,20 @@
         <w:pStyle w:val="FirstParagraph"/>
       </w:pPr>
       <w:r>
-        <w:t xml:space="preserve">A partir de esos resultados, De Neys propone un modelo. El sistema 1 activa</w:t>
+        <w:t xml:space="preserve">El primer acierto es que De Neys, a diferencia de los modelos anteriores,</w:t>
+      </w:r>
+      <w:r>
+        <w:t xml:space="preserve"> </w:t>
+      </w:r>
+      <w:r>
+        <w:rPr>
+          <w:bCs/>
+          <w:b/>
+        </w:rPr>
+        <w:t xml:space="preserve">especifica un mecanismo</w:t>
+      </w:r>
+      <w:r>
+        <w:t xml:space="preserve">, y tiene cuatro piezas. El sistema 1 activa</w:t>
       </w:r>
       <w:r>
         <w:t xml:space="preserve"> </w:t>
@@ -963,7 +1051,40 @@
         <w:t xml:space="preserve"> </w:t>
       </w:r>
       <w:r>
-        <w:t xml:space="preserve">de distinta fuerza, incluida la lógica. Un</w:t>
+        <w:t xml:space="preserve">de distinta fuerza, incluida la lógica: ante el bate y la pelota pueden activarse a la vez</w:t>
+      </w:r>
+      <w:r>
+        <w:t xml:space="preserve"> </w:t>
+      </w:r>
+      <w:r>
+        <w:t xml:space="preserve">“</w:t>
+      </w:r>
+      <w:r>
+        <w:t xml:space="preserve">10 centavos</w:t>
+      </w:r>
+      <w:r>
+        <w:t xml:space="preserve">”</w:t>
+      </w:r>
+      <w:r>
+        <w:t xml:space="preserve"> </w:t>
+      </w:r>
+      <w:r>
+        <w:t xml:space="preserve">y</w:t>
+      </w:r>
+      <w:r>
+        <w:t xml:space="preserve"> </w:t>
+      </w:r>
+      <w:r>
+        <w:t xml:space="preserve">“</w:t>
+      </w:r>
+      <w:r>
+        <w:t xml:space="preserve">5 centavos</w:t>
+      </w:r>
+      <w:r>
+        <w:t xml:space="preserve">”</w:t>
+      </w:r>
+      <w:r>
+        <w:t xml:space="preserve">. Un</w:t>
       </w:r>
       <w:r>
         <w:t xml:space="preserve"> </w:t>
@@ -1011,7 +1132,7 @@
         <w:t xml:space="preserve"> </w:t>
       </w:r>
       <w:r>
-        <w:t xml:space="preserve">ajusta las intuiciones y apaga la deliberación. Conclusión: todo modelo dual viable tiene que ser</w:t>
+        <w:t xml:space="preserve">ajusta las intuiciones y apaga la deliberación. Por eso concluye que todo modelo dual viable tiene que ser</w:t>
       </w:r>
       <w:r>
         <w:t xml:space="preserve"> </w:t>
@@ -1118,13 +1239,13 @@
       </w:r>
     </w:p>
     <w:bookmarkEnd w:id="25"/>
-    <w:bookmarkStart w:id="26" w:name="diapositiva-6-acierto-1-125"/>
+    <w:bookmarkStart w:id="26" w:name="X1b34caa1eac8c8e1774cb95152d1e134af4b52c"/>
     <w:p>
       <w:pPr>
         <w:pStyle w:val="Heading3"/>
       </w:pPr>
       <w:r>
-        <w:t xml:space="preserve">Diapositiva 6 — Acierto 1 (1:25)</w:t>
+        <w:t xml:space="preserve">Diapositiva 6 — Lo que a Evans le faltaba (1:15)</w:t>
       </w:r>
     </w:p>
     <w:p>
@@ -1132,7 +1253,7 @@
         <w:pStyle w:val="FirstParagraph"/>
       </w:pPr>
       <w:r>
-        <w:t xml:space="preserve">El primer acierto es que hace explícito un supuesto que vimos en la materia: el de la teoría heurístico-analítica de Evans. Para Evans hay un estadio</w:t>
+        <w:t xml:space="preserve">Esto llena un hueco que vimos en la materia, en la teoría heurístico-analítica de Evans. Para Evans hay un estadio</w:t>
       </w:r>
       <w:r>
         <w:t xml:space="preserve"> </w:t>
@@ -1187,7 +1308,7 @@
         <w:t xml:space="preserve">competencia</w:t>
       </w:r>
       <w:r>
-        <w:t xml:space="preserve">, al segundo (Valiña y Martín, 2014, pp. 19-20, 22). Esa es justamente la exclusividad, y De Neys muestra lo que a Evans le faltaba:</w:t>
+        <w:t xml:space="preserve">, al segundo (Valiña y Martín, 2014, pp. 19-20, 22). Esa es justamente la exclusividad, y Evans no explicaba</w:t>
       </w:r>
       <w:r>
         <w:t xml:space="preserve"> </w:t>
@@ -1203,7 +1324,7 @@
         <w:t xml:space="preserve"> </w:t>
       </w:r>
       <w:r>
-        <w:t xml:space="preserve">lo analítico. Además, que deliberar a veces solo</w:t>
+        <w:t xml:space="preserve">lo analítico; De Neys sí: la incertidumbre. Además, que deliberar a veces solo</w:t>
       </w:r>
       <w:r>
         <w:t xml:space="preserve"> </w:t>
@@ -1237,7 +1358,7 @@
         <w:t xml:space="preserve"> </w:t>
       </w:r>
       <w:r>
-        <w:t xml:space="preserve">(Valiña y Martín, 2014, p. 20). Por ejemplo, alguien puede deliberar solo para encontrar razones a favor de los 10 centavos.</w:t>
+        <w:t xml:space="preserve">(Valiña y Martín, 2014, p. 20).</w:t>
       </w:r>
     </w:p>
     <w:p>
@@ -1245,7 +1366,7 @@
         <w:pStyle w:val="BodyText"/>
       </w:pPr>
       <w:r>
-        <w:t xml:space="preserve">Hay un segundo aporte. A Tversky y Kahneman se les criticó que su teoría es</w:t>
+        <w:t xml:space="preserve">Y responde a una crítica que vimos a Tversky y Kahneman: que su teoría es</w:t>
       </w:r>
       <w:r>
         <w:t xml:space="preserve"> </w:t>
@@ -1261,23 +1382,7 @@
         <w:t xml:space="preserve"> </w:t>
       </w:r>
       <w:r>
-        <w:t xml:space="preserve">(Pérez Echeverría y Bautista, 2014, p. 18). De Neys, en cambio, propone un</w:t>
-      </w:r>
-      <w:r>
-        <w:t xml:space="preserve"> </w:t>
-      </w:r>
-      <w:r>
-        <w:rPr>
-          <w:bCs/>
-          <w:b/>
-        </w:rPr>
-        <w:t xml:space="preserve">mecanismo</w:t>
-      </w:r>
-      <w:r>
-        <w:t xml:space="preserve"> </w:t>
-      </w:r>
-      <w:r>
-        <w:t xml:space="preserve">—fuerza de las intuiciones, incertidumbre, umbral y retroalimentación— del que salen preguntas que se pueden poner a prueba.</w:t>
+        <w:t xml:space="preserve">(Pérez Echeverría y Bautista, 2014, p. 18). De Neys propone un proceso del que salen preguntas que se pueden poner a prueba.</w:t>
       </w:r>
     </w:p>
     <w:p>
@@ -1644,22 +1749,22 @@
     </w:p>
     <w:bookmarkEnd w:id="30"/>
     <w:bookmarkEnd w:id="31"/>
-    <w:bookmarkStart w:id="34" w:name="expositora-5-crítica-2-y-cierre-200"/>
+    <w:bookmarkStart w:id="33" w:name="X4f0bed3b21db52dbddae9017ee934a952fda923"/>
     <w:p>
       <w:pPr>
         <w:pStyle w:val="Heading2"/>
       </w:pPr>
       <w:r>
-        <w:t xml:space="preserve">Expositor/a 5 — Crítica 2 y cierre (2:00)</w:t>
-      </w:r>
-    </w:p>
-    <w:bookmarkStart w:id="32" w:name="X7756be326a471f0fd6fd0376dece5b32e059d09"/>
+        <w:t xml:space="preserve">Expositor/a 5 — Crítica 2: del laboratorio a la vida real (2:00)</w:t>
+      </w:r>
+    </w:p>
+    <w:bookmarkStart w:id="32" w:name="diapositiva-9"/>
     <w:p>
       <w:pPr>
         <w:pStyle w:val="Heading3"/>
       </w:pPr>
       <w:r>
-        <w:t xml:space="preserve">Diapositiva 9 — Crítica 2: tareas de laboratorio (1:20)</w:t>
+        <w:t xml:space="preserve">Diapositiva 9</w:t>
       </w:r>
     </w:p>
     <w:p>
@@ -1680,7 +1785,7 @@
         <w:t xml:space="preserve">las tareas</w:t>
       </w:r>
       <w:r>
-        <w:t xml:space="preserve">: toda la evidencia viene de problemas de laboratorio, bien definidos y con poco contenido, como el del bate y la pelota.</w:t>
+        <w:t xml:space="preserve">: toda la evidencia viene de problemas de laboratorio, bien definidos y con poco contenido, como el del bate y la pelota o elegir entre bandejas con bolitas.</w:t>
       </w:r>
     </w:p>
     <w:p>
@@ -1688,7 +1793,7 @@
         <w:pStyle w:val="BodyText"/>
       </w:pPr>
       <w:r>
-        <w:t xml:space="preserve">En solución de problemas, la investigación hizo el mismo camino: empezó con problemas sin contenido, que daban más control (Postigo Angón, 2014, p. 8), hasta que el enfoque de</w:t>
+        <w:t xml:space="preserve">En solución de problemas, la investigación hizo el mismo camino: empezó con problemas sin contenido, que daban más control experimental (Postigo Angón, 2014, p. 8), hasta que el enfoque de</w:t>
       </w:r>
       <w:r>
         <w:t xml:space="preserve"> </w:t>
@@ -1752,7 +1857,7 @@
         <w:t xml:space="preserve"> </w:t>
       </w:r>
       <w:r>
-        <w:t xml:space="preserve">(Pérez Echeverría y Bautista, 2014, p. 16). Entonces, ¿qué pasa con el modelo en los problemas mal definidos de la vida cotidiana, donde no hay respuesta correcta contra la cual medir? El autor lo admite como límite (De Neys, 2023b, p. 68).</w:t>
+        <w:t xml:space="preserve">(Pérez Echeverría y Bautista, 2014, p. 16).</w:t>
       </w:r>
     </w:p>
     <w:p>
@@ -1760,7 +1865,41 @@
         <w:pStyle w:val="BodyText"/>
       </w:pPr>
       <w:r>
-        <w:t xml:space="preserve">Además, que la lógica se automatice</w:t>
+        <w:t xml:space="preserve">Entonces, ¿qué pasa con el modelo en los problemas mal definidos de la vida cotidiana, donde no hay una respuesta correcta contra la cual medir la intuición? Evans distingue la racionalidad</w:t>
+      </w:r>
+      <w:r>
+        <w:t xml:space="preserve"> </w:t>
+      </w:r>
+      <w:r>
+        <w:rPr>
+          <w:bCs/>
+          <w:b/>
+        </w:rPr>
+        <w:t xml:space="preserve">de proceso</w:t>
+      </w:r>
+      <w:r>
+        <w:t xml:space="preserve">, ajustarse a una norma como la lógica, de la racionalidad</w:t>
+      </w:r>
+      <w:r>
+        <w:t xml:space="preserve"> </w:t>
+      </w:r>
+      <w:r>
+        <w:rPr>
+          <w:bCs/>
+          <w:b/>
+        </w:rPr>
+        <w:t xml:space="preserve">de propósito</w:t>
+      </w:r>
+      <w:r>
+        <w:t xml:space="preserve">, alcanzar los propios objetivos (Valiña y Martín, 2014, p. 21). El modelo de De Neys solo mide la primera, y el propio autor admite este límite (De Neys, 2023b, p. 68).</w:t>
+      </w:r>
+    </w:p>
+    <w:p>
+      <w:pPr>
+        <w:pStyle w:val="BodyText"/>
+      </w:pPr>
+      <w:r>
+        <w:t xml:space="preserve">Por último, la pieza más original del modelo, que la respuesta lógica se automatice,</w:t>
       </w:r>
       <w:r>
         <w:t xml:space="preserve"> </w:t>
@@ -1776,111 +1915,7 @@
         <w:t xml:space="preserve"> </w:t>
       </w:r>
       <w:r>
-        <w:t xml:space="preserve">(De Neys, 2023a, p. 13), y el autor no usa la tradición de Fischbein, que podría darle sustento.</w:t>
-      </w:r>
-    </w:p>
-    <w:p>
-      <w:pPr>
-        <w:pStyle w:val="BlockText"/>
-      </w:pPr>
-      <w:r>
-        <w:rPr>
-          <w:bCs/>
-          <w:b/>
-        </w:rPr>
-        <w:t xml:space="preserve">Si preguntan qué sería</w:t>
-      </w:r>
-      <w:r>
-        <w:rPr>
-          <w:bCs/>
-          <w:b/>
-        </w:rPr>
-        <w:t xml:space="preserve"> </w:t>
-      </w:r>
-      <w:r>
-        <w:rPr>
-          <w:bCs/>
-          <w:b/>
-        </w:rPr>
-        <w:t xml:space="preserve">“</w:t>
-      </w:r>
-      <w:r>
-        <w:rPr>
-          <w:bCs/>
-          <w:b/>
-        </w:rPr>
-        <w:t xml:space="preserve">acertar</w:t>
-      </w:r>
-      <w:r>
-        <w:rPr>
-          <w:bCs/>
-          <w:b/>
-        </w:rPr>
-        <w:t xml:space="preserve">”</w:t>
-      </w:r>
-      <w:r>
-        <w:rPr>
-          <w:bCs/>
-          <w:b/>
-        </w:rPr>
-        <w:t xml:space="preserve"> </w:t>
-      </w:r>
-      <w:r>
-        <w:rPr>
-          <w:bCs/>
-          <w:b/>
-        </w:rPr>
-        <w:t xml:space="preserve">fuera del laboratorio:</w:t>
-      </w:r>
-      <w:r>
-        <w:t xml:space="preserve"> </w:t>
-      </w:r>
-      <w:r>
-        <w:t xml:space="preserve">Evans distingue la racionalidad</w:t>
-      </w:r>
-      <w:r>
-        <w:t xml:space="preserve"> </w:t>
-      </w:r>
-      <w:r>
-        <w:rPr>
-          <w:bCs/>
-          <w:b/>
-        </w:rPr>
-        <w:t xml:space="preserve">de proceso</w:t>
-      </w:r>
-      <w:r>
-        <w:t xml:space="preserve">, ajustarse a una norma como la lógica, de la racionalidad</w:t>
-      </w:r>
-      <w:r>
-        <w:t xml:space="preserve"> </w:t>
-      </w:r>
-      <w:r>
-        <w:rPr>
-          <w:bCs/>
-          <w:b/>
-        </w:rPr>
-        <w:t xml:space="preserve">de propósito</w:t>
-      </w:r>
-      <w:r>
-        <w:t xml:space="preserve">, alcanzar los propios objetivos (Valiña y Martín, 2014, p. 21). En la vida cotidiana importa la segunda, y el modelo solo mide la primera.</w:t>
-      </w:r>
-    </w:p>
-    <w:bookmarkEnd w:id="32"/>
-    <w:bookmarkStart w:id="33" w:name="diapositiva-10-conclusión-y-debate-040"/>
-    <w:p>
-      <w:pPr>
-        <w:pStyle w:val="Heading3"/>
-      </w:pPr>
-      <w:r>
-        <w:t xml:space="preserve">Diapositiva 10 — Conclusión y debate (0:40)</w:t>
-      </w:r>
-    </w:p>
-    <w:p>
-      <w:pPr>
-        <w:pStyle w:val="FirstParagraph"/>
-      </w:pPr>
-      <w:r>
-        <w:t xml:space="preserve">En síntesis: el artículo muestra que la exclusividad y el mecanismo de cambio son el mismo problema, y propone un modelo que conserva la distinción entre intuición y deliberación. Sus límites: es verbal, la automatización está poco probada y las tareas son artificiales.</w:t>
+        <w:t xml:space="preserve">(De Neys, 2023a, p. 13). Y el autor no recurre a la tradición de Fischbein, que estudió justamente cómo la instrucción genera intuiciones nuevas y podría darle sustento.</w:t>
       </w:r>
     </w:p>
     <w:p>
@@ -1888,58 +1923,7 @@
         <w:pStyle w:val="BodyText"/>
       </w:pPr>
       <w:r>
-        <w:t xml:space="preserve">Y les preguntamos:</w:t>
-      </w:r>
-      <w:r>
-        <w:t xml:space="preserve"> </w:t>
-      </w:r>
-      <w:r>
-        <w:rPr>
-          <w:bCs/>
-          <w:b/>
-        </w:rPr>
-        <w:t xml:space="preserve">¿les pasó que algo que al principio tenían que pensar con esfuerzo, después les saliera</w:t>
-      </w:r>
-      <w:r>
-        <w:rPr>
-          <w:bCs/>
-          <w:b/>
-        </w:rPr>
-        <w:t xml:space="preserve"> </w:t>
-      </w:r>
-      <w:r>
-        <w:rPr>
-          <w:bCs/>
-          <w:b/>
-        </w:rPr>
-        <w:t xml:space="preserve">“</w:t>
-      </w:r>
-      <w:r>
-        <w:rPr>
-          <w:bCs/>
-          <w:b/>
-        </w:rPr>
-        <w:t xml:space="preserve">solo</w:t>
-      </w:r>
-      <w:r>
-        <w:rPr>
-          <w:bCs/>
-          <w:b/>
-        </w:rPr>
-        <w:t xml:space="preserve">”</w:t>
-      </w:r>
-      <w:r>
-        <w:rPr>
-          <w:bCs/>
-          <w:b/>
-        </w:rPr>
-        <w:t xml:space="preserve">?</w:t>
-      </w:r>
-      <w:r>
-        <w:t xml:space="preserve"> </w:t>
-      </w:r>
-      <w:r>
-        <w:t xml:space="preserve">Por ejemplo, en estadística. Esa respuesta automática, ¿es una intuición, como dice De Neys, o sigue siendo pensamiento deliberado, pero más rápido?</w:t>
+        <w:t xml:space="preserve">Con esto terminamos la exposición. Ahora queremos abrir el debate.</w:t>
       </w:r>
     </w:p>
     <w:p>
@@ -1949,15 +1933,120 @@
         </w:pict>
       </w:r>
     </w:p>
+    <w:bookmarkEnd w:id="32"/>
     <w:bookmarkEnd w:id="33"/>
+    <w:bookmarkStart w:id="35" w:name="Xab0003fd97d7e285c043128d43b4857ee839841"/>
+    <w:p>
+      <w:pPr>
+        <w:pStyle w:val="Heading2"/>
+      </w:pPr>
+      <w:r>
+        <w:t xml:space="preserve">Debate — todo el grupo (después de los 10 minutos)</w:t>
+      </w:r>
+    </w:p>
+    <w:bookmarkStart w:id="34" w:name="diapositiva-10-para-debatir"/>
+    <w:p>
+      <w:pPr>
+        <w:pStyle w:val="Heading3"/>
+      </w:pPr>
+      <w:r>
+        <w:t xml:space="preserve">Diapositiva 10 — Para debatir</w:t>
+      </w:r>
+    </w:p>
+    <w:p>
+      <w:pPr>
+        <w:pStyle w:val="FirstParagraph"/>
+      </w:pPr>
+      <w:r>
+        <w:t xml:space="preserve">Cualquiera del grupo lanza la pregunta:</w:t>
+      </w:r>
+    </w:p>
+    <w:p>
+      <w:pPr>
+        <w:pStyle w:val="BodyText"/>
+      </w:pPr>
+      <w:r>
+        <w:t xml:space="preserve">Les queremos preguntar:</w:t>
+      </w:r>
+      <w:r>
+        <w:t xml:space="preserve"> </w:t>
+      </w:r>
+      <w:r>
+        <w:rPr>
+          <w:bCs/>
+          <w:b/>
+        </w:rPr>
+        <w:t xml:space="preserve">¿les pasó que algo que al principio tenían que pensar con esfuerzo, después les saliera</w:t>
+      </w:r>
+      <w:r>
+        <w:rPr>
+          <w:bCs/>
+          <w:b/>
+        </w:rPr>
+        <w:t xml:space="preserve"> </w:t>
+      </w:r>
+      <w:r>
+        <w:rPr>
+          <w:bCs/>
+          <w:b/>
+        </w:rPr>
+        <w:t xml:space="preserve">“</w:t>
+      </w:r>
+      <w:r>
+        <w:rPr>
+          <w:bCs/>
+          <w:b/>
+        </w:rPr>
+        <w:t xml:space="preserve">solo</w:t>
+      </w:r>
+      <w:r>
+        <w:rPr>
+          <w:bCs/>
+          <w:b/>
+        </w:rPr>
+        <w:t xml:space="preserve">”</w:t>
+      </w:r>
+      <w:r>
+        <w:rPr>
+          <w:bCs/>
+          <w:b/>
+        </w:rPr>
+        <w:t xml:space="preserve">?</w:t>
+      </w:r>
+      <w:r>
+        <w:t xml:space="preserve"> </w:t>
+      </w:r>
+      <w:r>
+        <w:t xml:space="preserve">Por ejemplo, en estadística. Esa respuesta automática, ¿es una intuición, como dice De Neys, o sigue siendo pensamiento deliberado, pero más rápido?</w:t>
+      </w:r>
+    </w:p>
+    <w:p>
+      <w:pPr>
+        <w:pStyle w:val="BlockText"/>
+      </w:pPr>
+      <w:r>
+        <w:rPr>
+          <w:bCs/>
+          <w:b/>
+        </w:rPr>
+        <w:t xml:space="preserve">Si el docente pide una conclusión:</w:t>
+      </w:r>
+      <w:r>
+        <w:t xml:space="preserve"> </w:t>
+      </w:r>
+      <w:r>
+        <w:t xml:space="preserve">el artículo muestra que la exclusividad y el mecanismo de cambio son el mismo problema, y propone un modelo que conserva la distinción entre intuición y deliberación. Sus límites: es verbal, la automatización está poco probada y las tareas son artificiales. Como líneas futuras, estudios de entrenamiento que sigan cómo una respuesta deliberada se vuelve intuitiva, y llevar el modelo a problemas reales y a dominios de pericia.</w:t>
+      </w:r>
+    </w:p>
     <w:bookmarkEnd w:id="34"/>
-    <w:bookmarkStart w:id="35" w:name="para-sostener-el-debate-todo-el-grupo"/>
+    <w:bookmarkEnd w:id="35"/>
+    <w:bookmarkStart w:id="36" w:name="para-sostener-el-debate"/>
     <w:p>
       <w:pPr>
         <w:pStyle w:val="Heading2"/>
       </w:pPr>
       <w:r>
-        <w:t xml:space="preserve">Para sostener el debate (todo el grupo)</w:t>
+        <w:t xml:space="preserve">Para sostener el debate</w:t>
       </w:r>
     </w:p>
     <w:p>
@@ -2295,8 +2384,8 @@
         </w:tc>
       </w:tr>
     </w:tbl>
-    <w:bookmarkEnd w:id="35"/>
-    <w:bookmarkStart w:id="36" w:name="referencias"/>
+    <w:bookmarkEnd w:id="36"/>
+    <w:bookmarkStart w:id="37" w:name="referencias"/>
     <w:p>
       <w:pPr>
         <w:pStyle w:val="Heading2"/>
@@ -2469,8 +2558,8 @@
         <w:t xml:space="preserve">(cap. 6). Alianza.</w:t>
       </w:r>
     </w:p>
-    <w:bookmarkEnd w:id="36"/>
     <w:bookmarkEnd w:id="37"/>
+    <w:bookmarkEnd w:id="38"/>
     <w:sectPr>
       <w:headerReference r:id="rId9" w:type="default"/>
       <w:footerReference r:id="rId10" w:type="default"/>

</xml_diff>